<commit_message>
docs/scripts: continue working on protocol reconstruction
</commit_message>
<xml_diff>
--- a/docs/protocol/init_change_mode_1.docx
+++ b/docs/protocol/init_change_mode_1.docx
@@ -3742,7 +3742,17 @@
         <w:t>01</w:t>
       </w:r>
       <w:r>
-        <w:t xml:space="preserve"> 00 00 00 00 00 00 08 60 </w:t>
+        <w:t xml:space="preserve"> 00 00 00 00 00 00 </w:t>
+      </w:r>
+      <w:r>
+        <w:rPr>
+          <w:b/>
+          <w:bCs/>
+        </w:rPr>
+        <w:t>08 60</w:t>
+      </w:r>
+      <w:r>
+        <w:t xml:space="preserve"> </w:t>
       </w:r>
       <w:r>
         <w:rPr>
@@ -4211,7 +4221,17 @@
         <w:t>01</w:t>
       </w:r>
       <w:r>
-        <w:t xml:space="preserve"> 00 00 00 00 00 00 08 60 </w:t>
+        <w:t xml:space="preserve"> 00 00 00 00 00 00 </w:t>
+      </w:r>
+      <w:r>
+        <w:rPr>
+          <w:b/>
+          <w:bCs/>
+        </w:rPr>
+        <w:t>08 60</w:t>
+      </w:r>
+      <w:r>
+        <w:t xml:space="preserve"> </w:t>
       </w:r>
       <w:r>
         <w:rPr>
@@ -4370,10 +4390,21 @@
         <w:t xml:space="preserve"> </w:t>
       </w:r>
       <w:r>
-        <w:t xml:space="preserve">e4 de 19 00 3f </w:t>
-      </w:r>
-      <w:proofErr w:type="spellStart"/>
-      <w:r>
+        <w:t xml:space="preserve">e4 de 19 00 </w:t>
+      </w:r>
+      <w:r>
+        <w:rPr>
+          <w:b/>
+          <w:bCs/>
+        </w:rPr>
+        <w:t xml:space="preserve">3f </w:t>
+      </w:r>
+      <w:proofErr w:type="spellStart"/>
+      <w:r>
+        <w:rPr>
+          <w:b/>
+          <w:bCs/>
+        </w:rPr>
         <w:t>eb</w:t>
       </w:r>
       <w:proofErr w:type="spellEnd"/>
@@ -4472,7 +4503,17 @@
         <w:t>01</w:t>
       </w:r>
       <w:r>
-        <w:t xml:space="preserve"> 00 00 00 00 00 00 08 60 </w:t>
+        <w:t xml:space="preserve"> 00 00 00 00 00 00 </w:t>
+      </w:r>
+      <w:r>
+        <w:rPr>
+          <w:b/>
+          <w:bCs/>
+        </w:rPr>
+        <w:t>08 60</w:t>
+      </w:r>
+      <w:r>
+        <w:t xml:space="preserve"> </w:t>
       </w:r>
       <w:r>
         <w:rPr>
@@ -4614,10 +4655,21 @@
         <w:t>0c 01</w:t>
       </w:r>
       <w:r>
-        <w:t xml:space="preserve"> e4 de 19 00 3f </w:t>
-      </w:r>
-      <w:proofErr w:type="spellStart"/>
-      <w:r>
+        <w:t xml:space="preserve"> e4 de 19 00 </w:t>
+      </w:r>
+      <w:r>
+        <w:rPr>
+          <w:b/>
+          <w:bCs/>
+        </w:rPr>
+        <w:t xml:space="preserve">3f </w:t>
+      </w:r>
+      <w:proofErr w:type="spellStart"/>
+      <w:r>
+        <w:rPr>
+          <w:b/>
+          <w:bCs/>
+        </w:rPr>
         <w:t>eb</w:t>
       </w:r>
       <w:proofErr w:type="spellEnd"/>
@@ -4716,7 +4768,17 @@
         <w:t>01</w:t>
       </w:r>
       <w:r>
-        <w:t xml:space="preserve"> 00 00 00 00 00 00 08 60 </w:t>
+        <w:t xml:space="preserve"> 00 00 00 00 00 00 </w:t>
+      </w:r>
+      <w:r>
+        <w:rPr>
+          <w:b/>
+          <w:bCs/>
+        </w:rPr>
+        <w:t>08 60</w:t>
+      </w:r>
+      <w:r>
+        <w:t xml:space="preserve"> </w:t>
       </w:r>
       <w:r>
         <w:rPr>

</xml_diff>